<commit_message>
Xand Avião: revisão crítica da Parte 2
Co-Authored-By: Claude Opus 5.5 <noreply@anthropic.com>
Claude-Session: https://claude.ai/code/session_01MJjUEEZrxQDEUifKK2vj9g
</commit_message>
<xml_diff>
--- a/roteiros/xand-aviao/XandAviao_Parte2.docx
+++ b/roteiros/xand-aviao/XandAviao_Parte2.docx
@@ -39,7 +39,7 @@
         <w:rPr>
           <w:color w:val="000000"/>
         </w:rPr>
-        <w:t>Os dois mal se conheciam. Em pouco tempo, iam virar a dupla mais famosa do forró brasileiro.</w:t>
+        <w:t>Em pouco tempo, os dois iam virar a dupla mais famosa do forró brasileiro.</w:t>
       </w:r>
     </w:p>
     <w:p>
@@ -47,7 +47,7 @@
         <w:rPr>
           <w:color w:val="000000"/>
         </w:rPr>
-        <w:t>O primeiro disco saiu em setembro daquele ano. Vendeu cerca de duzentas mil cópias, quase todas de mão em mão, nas feiras e nas bancas de CD do Nordeste.</w:t>
+        <w:t>O primeiro disco saiu em setembro daquele ano. Vendeu cerca de duzentas mil cópias.</w:t>
       </w:r>
     </w:p>
     <w:p>
@@ -63,7 +63,7 @@
         <w:rPr>
           <w:color w:val="000000"/>
         </w:rPr>
-        <w:t>O terceiro, em dois mil e cinco, passou das quinhentas mil. Tinha uma música que tocava em todo paredão de som do Nordeste. "Tontos e Loucos."</w:t>
+        <w:t>O terceiro, em dois mil e cinco, passou das quinhentas mil. Tinha uma música que tomou os paredões de som do Nordeste. "Tontos e Loucos."</w:t>
       </w:r>
     </w:p>
     <w:p>
@@ -79,7 +79,7 @@
         <w:rPr>
           <w:color w:val="C00000"/>
         </w:rPr>
-        <w:t>Guarde este número. Anos depois, investigadores federais iam calcular quanto o Aviões do Forró faturava por ano. E iam descobrir que a maior parte desse dinheiro nunca aparecia nos papéis oficiais.</w:t>
+        <w:t>Cada disco vendido aumentava o valor da banda. Anos depois, investigadores federais iam calcular quanto o Aviões do Forró faturava por ano. E iam descobrir que a maior parte desse dinheiro nunca aparecia nos papéis oficiais.</w:t>
       </w:r>
     </w:p>
     <w:p>
@@ -95,7 +95,7 @@
         <w:rPr>
           <w:color w:val="000000"/>
         </w:rPr>
-        <w:t>Em dois mil e seis, os empresários organizaram os negócios numa empresa. Deram a ela o nome de A3 Entretenimento.</w:t>
+        <w:t>Em dois mil e seis, parte desses empresários, ao lado de outros sócios, criou uma empresa para cuidar dos negócios. O nome era A3 Entretenimento.</w:t>
       </w:r>
     </w:p>
     <w:p>
@@ -111,7 +111,7 @@
         <w:rPr>
           <w:color w:val="000000"/>
         </w:rPr>
-        <w:t>Com o tempo, passou a agenciar dezenas de outras bandas e cantores. Pela empresa passaram nomes como a Banda Calypso e um cantor goiano que ainda ia virar um fenômeno nacional, Gusttavo Lima.</w:t>
+        <w:t>Com o tempo, passou a agenciar dezenas de outras bandas e cantores. Pela empresa passaram nomes como a Banda Calypso e um cantor goiano chamado Gusttavo Lima.</w:t>
       </w:r>
     </w:p>
     <w:p>
@@ -119,7 +119,7 @@
         <w:rPr>
           <w:color w:val="000000"/>
         </w:rPr>
-        <w:t>A A3 comprou emissoras de rádio em Fortaleza, como a 102 FM e a 91 FM. Abriu casas de forró que viviam lotadas, como o Kangalha e o Galpão 4.</w:t>
+        <w:t>A A3 passou a controlar emissoras de rádio em Fortaleza, como a 102 FM e a 91 FM. E casas de forró famosas na cidade, como o Kangalha e o Galpão 4.</w:t>
       </w:r>
     </w:p>
     <w:p>
@@ -127,7 +127,7 @@
         <w:rPr>
           <w:color w:val="000000"/>
         </w:rPr>
-        <w:t>Era um sistema fechado. A empresa lançava a banda, tocava a música nas próprias rádios e vendia o show nas próprias casas.</w:t>
+        <w:t>Na prática, a mesma empresa podia lançar uma banda, tocar a música nas próprias rádios e vender o show nas próprias casas.</w:t>
       </w:r>
     </w:p>
     <w:p>
@@ -183,7 +183,7 @@
         <w:rPr>
           <w:color w:val="C00000"/>
         </w:rPr>
-        <w:t>E foi justamente nessa fase de crescimento que alguém de dentro do negócio começou a guardar informações. Anos depois, essa pessoa ia levar uma denúncia às autoridades. E o que estava escrito nela era muito mais pesado do que qualquer briga de mercado.</w:t>
+        <w:t>Só que um crescimento tão rápido também cria inimigos. E, segundo reportagens publicadas anos depois, um deles teria saído de dentro da própria empresa. O que ele levou às autoridades era muito mais pesado do que qualquer briga de mercado.</w:t>
       </w:r>
     </w:p>
     <w:p>
@@ -239,7 +239,7 @@
         <w:rPr>
           <w:color w:val="000000"/>
         </w:rPr>
-        <w:t>Foi nesse mesmo ano que os vocalistas assinaram um contrato novo com a empresa.</w:t>
+        <w:t>Foi nesse mesmo ano que Solange e os sócios da banda assinaram um contrato novo.</w:t>
       </w:r>
     </w:p>
     <w:p>
@@ -247,7 +247,7 @@
         <w:rPr>
           <w:color w:val="000000"/>
         </w:rPr>
-        <w:t>Esse é o terceiro objeto dessa história. Um contrato assinado em dois mil e dez, com uma cláusula que quase ninguém leu com atenção.</w:t>
+        <w:t>Esse é o terceiro objeto dessa história. Um contrato assinado em dois mil e dez, com uma cláusula que parecia só mais uma linha de papel.</w:t>
       </w:r>
     </w:p>
     <w:p>
@@ -255,7 +255,7 @@
         <w:rPr>
           <w:color w:val="000000"/>
         </w:rPr>
-        <w:t>Uma cláusula que, nove anos depois, ia decidir quem ficaria com o dinheiro quando tudo acabasse.</w:t>
+        <w:t>Nove anos depois, essa cláusula ia decidir o destino da maior briga da história da banda.</w:t>
       </w:r>
     </w:p>
     <w:p>
@@ -263,7 +263,7 @@
         <w:rPr>
           <w:color w:val="C00000"/>
         </w:rPr>
-        <w:t>Guarde esse contrato. Porque, quando a parceria desmoronou, foi uma única frase escrita nele que derrubou uma cobrança de milhões. E quem saiu perdendo foi justamente quem acreditava ter mais direito.</w:t>
+        <w:t>Guarde esse contrato. Porque, quando a parceria desmoronou, foi uma única cláusula escrita nele que derrubou uma cobrança de milhões. E quem cobrava acabou condenada a pagar.</w:t>
       </w:r>
     </w:p>
     <w:p>
@@ -327,7 +327,7 @@
         <w:rPr>
           <w:color w:val="000000"/>
         </w:rPr>
-        <w:t>A A3 era, naquele momento, o nome mais poderoso do forró brasileiro.</w:t>
+        <w:t>A A3 era, naquele momento, um dos grupos mais poderosos do forró brasileiro.</w:t>
       </w:r>
     </w:p>
     <w:p>
@@ -359,7 +359,7 @@
         <w:rPr>
           <w:color w:val="000000"/>
         </w:rPr>
-        <w:t>Cada apresentação era contratada por prefeituras, casas de show e organizadores de festas. Muitas vezes, com dinheiro público de festas juninas e aniversários de cidades.</w:t>
+        <w:t>Entre os contratantes estavam casas de show, organizadores de festas e prefeituras, que pagavam os shows com dinheiro público.</w:t>
       </w:r>
     </w:p>
     <w:p>
@@ -407,7 +407,7 @@
         <w:rPr>
           <w:color w:val="000000"/>
         </w:rPr>
-        <w:t>Em dois mil e quinze, o Aviões gravou um DVD num parque aquático em Fortaleza e entrou na parada da Billboard.</w:t>
+        <w:t>Em dois mil e quinze, o Aviões gravou um DVD num parque aquático perto de Fortaleza e entrou na parada da Billboard.</w:t>
       </w:r>
     </w:p>
     <w:p>
@@ -463,7 +463,7 @@
         <w:rPr>
           <w:color w:val="000000"/>
         </w:rPr>
-        <w:t>Ela contaria depois que chegou a propor a Xand um projeto novo, só dos dois, fora da empresa.</w:t>
+        <w:t>Anos depois, Xand contou que Solange chegou a propor a ele um projeto novo, só dos dois.</w:t>
       </w:r>
     </w:p>
     <w:p>
@@ -471,7 +471,7 @@
         <w:rPr>
           <w:color w:val="000000"/>
         </w:rPr>
-        <w:t>Segundo o próprio Xand, ele recusou.</w:t>
+        <w:t>Ele recusou.</w:t>
       </w:r>
     </w:p>
     <w:p>

</xml_diff>

<commit_message>
Xand Avião: revisão geral de retenção e anti-IA, roteiro completo
Co-Authored-By: Claude Opus 5.5 <noreply@anthropic.com>
Claude-Session: https://claude.ai/code/session_01MJjUEEZrxQDEUifKK2vj9g
</commit_message>
<xml_diff>
--- a/roteiros/xand-aviao/XandAviao_Parte2.docx
+++ b/roteiros/xand-aviao/XandAviao_Parte2.docx
@@ -143,7 +143,7 @@
         <w:rPr>
           <w:color w:val="000000"/>
         </w:rPr>
-        <w:t>No palco, ele era o showman. Brincava com o público, puxava coro, apresentava os músicos como personagens. Anos depois, contou que foi ele quem criou alguns desses personagens da banda, como o baterista apresentado ao público como "Riquelme da Batera".</w:t>
+        <w:t>No palco, ele era o showman. Brincava com o público, puxava coro, apresentava os músicos como personagens. Em entrevistas, contou que foi ele quem criou alguns desses personagens da banda, como o baterista apresentado ao público como "Riquelme da Batera".</w:t>
       </w:r>
     </w:p>
     <w:p>
@@ -183,7 +183,7 @@
         <w:rPr>
           <w:color w:val="C00000"/>
         </w:rPr>
-        <w:t>Só que um crescimento tão rápido também cria inimigos. E, segundo reportagens publicadas anos depois, um deles teria saído de dentro da própria empresa. O que ele levou às autoridades era muito mais pesado do que qualquer briga de mercado.</w:t>
+        <w:t>Só que um crescimento tão rápido também cria inimigos. E, segundo reportagens publicadas mais tarde, um deles teria saído de dentro da própria empresa. O que ele levou às autoridades era muito mais pesado do que qualquer briga de mercado.</w:t>
       </w:r>
     </w:p>
     <w:p>
@@ -303,7 +303,7 @@
         <w:rPr>
           <w:color w:val="000000"/>
         </w:rPr>
-        <w:t>Só que, longe da televisão, o mercado do forró estava em guerra.</w:t>
+        <w:t>Longe da televisão, porém, o mercado do forró vivia uma guerra silenciosa.</w:t>
       </w:r>
     </w:p>
     <w:p>
@@ -375,7 +375,7 @@
         <w:rPr>
           <w:color w:val="C00000"/>
         </w:rPr>
-        <w:t>Só que, naquele mesmo ano de dois mil e doze, enquanto trinta mil pessoas cantavam os sucessos da banda, um documento chegou às autoridades. Uma denúncia anônima. E o que estava escrito nela colocava o nome dos donos do Aviões do Forró ao lado de palavras que nenhum fã jamais imaginou.</w:t>
+        <w:t>Naquele mesmo ano de dois mil e doze, porém, enquanto trinta mil pessoas cantavam os sucessos da banda, um documento chegou às autoridades. Uma denúncia anônima. E o que estava escrito nela colocava o nome dos donos do Aviões do Forró ao lado de palavras sombrias, que nenhum fã jamais imaginou.</w:t>
       </w:r>
     </w:p>
     <w:p>
@@ -431,7 +431,7 @@
         <w:rPr>
           <w:color w:val="C00000"/>
         </w:rPr>
-        <w:t>Anos depois, a mãe dos dois filhos mais velhos ia expor nas redes sociais a diferença entre as duas famílias. E a resposta de Xand ia virar mais uma polêmica.</w:t>
+        <w:t>Mais tarde, a mãe dos dois filhos mais velhos ia expor, numa postagem dolorosa, a diferença entre as duas famílias. E a resposta de Xand ia virar mais uma polêmica.</w:t>
       </w:r>
     </w:p>
     <w:p>
@@ -463,7 +463,7 @@
         <w:rPr>
           <w:color w:val="000000"/>
         </w:rPr>
-        <w:t>Anos depois, Xand contou que Solange chegou a propor a ele um projeto novo, só dos dois.</w:t>
+        <w:t>Em dois mil e vinte e cinco, Xand contou que Solange chegou a propor a ele um projeto novo, só dos dois.</w:t>
       </w:r>
     </w:p>
     <w:p>

</xml_diff>